<commit_message>
EgD-EVE-DI-001 rev 2: correct 'three lifecycle movements' to 'four lifecycle capabilities Gartner names'; rebuild all three surfaces and hash register
</commit_message>
<xml_diff>
--- a/docs/di/SteelCloudSolutions_EVE_Decision_Intelligence_Layer.docx
+++ b/docs/di/SteelCloudSolutions_EVE_Decision_Intelligence_Layer.docx
@@ -402,7 +402,7 @@
                 <w:color w:val="2B2B2B"/>
                 <w:sz w:val="17"/>
               </w:rPr>
-              <w:t>aff69cba358e7f7136dc76c78ebec5aa1be90bc94b45e9c1f060ad83a1bfe290</w:t>
+              <w:t>4f1a6e9fd6cbd5c4cc8e98c8ce4232e53c75737e903536076b7fa4e932177881</w:t>
             </w:r>
           </w:p>
         </w:tc>
@@ -458,7 +458,7 @@
                 <w:color w:val="2B2B2B"/>
                 <w:sz w:val="17"/>
               </w:rPr>
-              <w:t>2026-09-21T01:39:55Z</w:t>
+              <w:t>2026-09-21T01:43:16Z</w:t>
             </w:r>
           </w:p>
         </w:tc>
@@ -549,7 +549,7 @@
           <w:color w:val="2B2B2B"/>
           <w:sz w:val="21"/>
         </w:rPr>
-        <w:t xml:space="preserve">. This section is written as a conformance statement against your list, grouped into the three lifecycle movements Gartner uses, with an </w:t>
+        <w:t xml:space="preserve">. This section is written as a conformance statement against your list, grouped into the four lifecycle capabilities Gartner names, with an </w:t>
       </w:r>
       <w:r>
         <w:rPr>
@@ -3396,7 +3396,7 @@
                 <w:color w:val="2B2B2B"/>
                 <w:sz w:val="17"/>
               </w:rPr>
-              <w:t>aff69cba358e7f7136dc76c78ebec5aa…</w:t>
+              <w:t>4f1a6e9fd6cbd5c4cc8e98c8ce4232e5…</w:t>
             </w:r>
           </w:p>
         </w:tc>
@@ -3506,7 +3506,7 @@
                 <w:color w:val="2B2B2B"/>
                 <w:sz w:val="17"/>
               </w:rPr>
-              <w:t>487e88f4a541f4b4f93f68e4e9fe90d6…</w:t>
+              <w:t>d6f6363f73f8859b34601f2b9f3ebdde…</w:t>
             </w:r>
           </w:p>
         </w:tc>
@@ -3616,7 +3616,7 @@
                 <w:color w:val="2B2B2B"/>
                 <w:sz w:val="17"/>
               </w:rPr>
-              <w:t>9df18b9f8931d799e2d913fbb9f7383b…</w:t>
+              <w:t>88e9defeb5725b1c573dbace897baa65…</w:t>
             </w:r>
           </w:p>
         </w:tc>
@@ -5865,7 +5865,7 @@
           <w:color w:val="6B6B6B"/>
           <w:sz w:val="16"/>
         </w:rPr>
-        <w:t>aff69cba358e7f7136dc76c78ebec5aa1be90bc94b45e9c1f060ad83a1bfe290</w:t>
+        <w:t>4f1a6e9fd6cbd5c4cc8e98c8ce4232e53c75737e903536076b7fa4e932177881</w:t>
       </w:r>
       <w:r>
         <w:rPr>
@@ -5875,7 +5875,7 @@
           <w:color w:val="6B6B6B"/>
           <w:sz w:val="16"/>
         </w:rPr>
-        <w:t xml:space="preserve"> · built 2026-09-21T01:39:55Z. Governed by </w:t>
+        <w:t xml:space="preserve"> · built 2026-09-21T01:43:16Z. Governed by </w:t>
       </w:r>
       <w:hyperlink r:id="rId20">
         <w:r>
@@ -5956,7 +5956,7 @@
         <w:color w:val="6B6B6B"/>
         <w:sz w:val="13"/>
       </w:rPr>
-      <w:t>© 2026 Steel Cloud Solutions, LLC · controlled draft · EgD-KEY-2026-07 · SHA-256 aff69cba358e7f71…</w:t>
+      <w:t>© 2026 Steel Cloud Solutions, LLC · controlled draft · EgD-KEY-2026-07 · SHA-256 4f1a6e9fd6cbd5c4…</w:t>
     </w:r>
     <w:r>
       <w:rPr>

</xml_diff>